<commit_message>
más faltas ortográficas solucionadas
</commit_message>
<xml_diff>
--- a/Fase 2/Evidencias de Proyecto/Documento 03- Definition of Done.docx
+++ b/Fase 2/Evidencias de Proyecto/Documento 03- Definition of Done.docx
@@ -13407,6 +13407,7 @@
     <w:rsid w:val="002471C3"/>
     <w:rsid w:val="00252686"/>
     <w:rsid w:val="002835FC"/>
+    <w:rsid w:val="0029094E"/>
     <w:rsid w:val="002C06A7"/>
     <w:rsid w:val="002D50C5"/>
     <w:rsid w:val="0034272F"/>
@@ -13431,6 +13432,7 @@
     <w:rsid w:val="00893355"/>
     <w:rsid w:val="009007E1"/>
     <w:rsid w:val="00960213"/>
+    <w:rsid w:val="00970C39"/>
     <w:rsid w:val="009B18C0"/>
     <w:rsid w:val="009B1E9D"/>
     <w:rsid w:val="009D4439"/>
@@ -14198,15 +14200,20 @@
 </file>
 
 <file path=customXml/item2.xml><?xml version="1.0" encoding="utf-8"?>
-<?mso-contentType ?>
-<FormTemplates xmlns="http://schemas.microsoft.com/sharepoint/v3/contenttype/forms">
-  <Display>DocumentLibraryForm</Display>
-  <Edit>DocumentLibraryForm</Edit>
-  <New>DocumentLibraryForm</New>
-</FormTemplates>
+<p:properties xmlns:p="http://schemas.microsoft.com/office/2006/metadata/properties" xmlns:xsi="http://www.w3.org/2001/XMLSchema-instance" xmlns:pc="http://schemas.microsoft.com/office/infopath/2007/PartnerControls">
+  <documentManagement>
+    <lcf76f155ced4ddcb4097134ff3c332f xmlns="e1e7bc46-bed0-459f-9452-a76b1c5b695e">
+      <Terms xmlns="http://schemas.microsoft.com/office/infopath/2007/PartnerControls"/>
+    </lcf76f155ced4ddcb4097134ff3c332f>
+  </documentManagement>
+</p:properties>
 </file>
 
 <file path=customXml/item3.xml><?xml version="1.0" encoding="utf-8"?>
+<b:Sources xmlns:b="http://schemas.openxmlformats.org/officeDocument/2006/bibliography" xmlns="http://schemas.openxmlformats.org/officeDocument/2006/bibliography" SelectedStyle="\APA.XSL" StyleName="APA"/>
+</file>
+
+<file path=customXml/item4.xml><?xml version="1.0" encoding="utf-8"?>
 <ct:contentTypeSchema xmlns:ct="http://schemas.microsoft.com/office/2006/metadata/contentType" xmlns:ma="http://schemas.microsoft.com/office/2006/metadata/properties/metaAttributes" ct:_="" ma:_="" ma:contentTypeName="Documento" ma:contentTypeID="0x0101005395107FFD641345A10C8A5ACACB9D20" ma:contentTypeVersion="13" ma:contentTypeDescription="Crear nuevo documento." ma:contentTypeScope="" ma:versionID="7407f70e7181b908656026f379795b2c">
   <xsd:schema xmlns:xsd="http://www.w3.org/2001/XMLSchema" xmlns:xs="http://www.w3.org/2001/XMLSchema" xmlns:p="http://schemas.microsoft.com/office/2006/metadata/properties" xmlns:ns2="e1e7bc46-bed0-459f-9452-a76b1c5b695e" xmlns:ns3="bb8cf7e1-610f-40a0-8f00-126b9d139fde" targetNamespace="http://schemas.microsoft.com/office/2006/metadata/properties" ma:root="true" ma:fieldsID="b29ea8901729e1eaaa4e48e09148c760" ns2:_="" ns3:_="">
     <xsd:import namespace="e1e7bc46-bed0-459f-9452-a76b1c5b695e"/>
@@ -14423,18 +14430,13 @@
 </ct:contentTypeSchema>
 </file>
 
-<file path=customXml/item4.xml><?xml version="1.0" encoding="utf-8"?>
-<b:Sources xmlns:b="http://schemas.openxmlformats.org/officeDocument/2006/bibliography" xmlns="http://schemas.openxmlformats.org/officeDocument/2006/bibliography" SelectedStyle="\APA.XSL" StyleName="APA"/>
-</file>
-
 <file path=customXml/item5.xml><?xml version="1.0" encoding="utf-8"?>
-<p:properties xmlns:p="http://schemas.microsoft.com/office/2006/metadata/properties" xmlns:xsi="http://www.w3.org/2001/XMLSchema-instance" xmlns:pc="http://schemas.microsoft.com/office/infopath/2007/PartnerControls">
-  <documentManagement>
-    <lcf76f155ced4ddcb4097134ff3c332f xmlns="e1e7bc46-bed0-459f-9452-a76b1c5b695e">
-      <Terms xmlns="http://schemas.microsoft.com/office/infopath/2007/PartnerControls"/>
-    </lcf76f155ced4ddcb4097134ff3c332f>
-  </documentManagement>
-</p:properties>
+<?mso-contentType ?>
+<FormTemplates xmlns="http://schemas.microsoft.com/sharepoint/v3/contenttype/forms">
+  <Display>DocumentLibraryForm</Display>
+  <Edit>DocumentLibraryForm</Edit>
+  <New>DocumentLibraryForm</New>
+</FormTemplates>
 </file>
 
 <file path=customXml/itemProps1.xml><?xml version="1.0" encoding="utf-8"?>
@@ -14446,14 +14448,24 @@
 </file>
 
 <file path=customXml/itemProps2.xml><?xml version="1.0" encoding="utf-8"?>
-<ds:datastoreItem xmlns:ds="http://schemas.openxmlformats.org/officeDocument/2006/customXml" ds:itemID="{EE9AAF0E-D63F-459F-A0FB-CDCE9F728F33}">
+<ds:datastoreItem xmlns:ds="http://schemas.openxmlformats.org/officeDocument/2006/customXml" ds:itemID="{E1036DFC-1D85-404D-898C-621D06C0EB1C}">
   <ds:schemaRefs>
-    <ds:schemaRef ds:uri="http://schemas.microsoft.com/sharepoint/v3/contenttype/forms"/>
+    <ds:schemaRef ds:uri="http://schemas.microsoft.com/office/2006/metadata/properties"/>
+    <ds:schemaRef ds:uri="http://schemas.microsoft.com/office/infopath/2007/PartnerControls"/>
+    <ds:schemaRef ds:uri="e1e7bc46-bed0-459f-9452-a76b1c5b695e"/>
   </ds:schemaRefs>
 </ds:datastoreItem>
 </file>
 
 <file path=customXml/itemProps3.xml><?xml version="1.0" encoding="utf-8"?>
+<ds:datastoreItem xmlns:ds="http://schemas.openxmlformats.org/officeDocument/2006/customXml" ds:itemID="{BD6EC776-6679-4C69-98E3-6D068EA0A3C9}">
+  <ds:schemaRefs>
+    <ds:schemaRef ds:uri="http://schemas.openxmlformats.org/officeDocument/2006/bibliography"/>
+  </ds:schemaRefs>
+</ds:datastoreItem>
+</file>
+
+<file path=customXml/itemProps4.xml><?xml version="1.0" encoding="utf-8"?>
 <ds:datastoreItem xmlns:ds="http://schemas.openxmlformats.org/officeDocument/2006/customXml" ds:itemID="{444115BD-C1C6-48AD-B714-E1866627071D}">
   <ds:schemaRefs>
     <ds:schemaRef ds:uri="http://schemas.microsoft.com/office/2006/metadata/contentType"/>
@@ -14472,20 +14484,10 @@
 </ds:datastoreItem>
 </file>
 
-<file path=customXml/itemProps4.xml><?xml version="1.0" encoding="utf-8"?>
-<ds:datastoreItem xmlns:ds="http://schemas.openxmlformats.org/officeDocument/2006/customXml" ds:itemID="{BD6EC776-6679-4C69-98E3-6D068EA0A3C9}">
+<file path=customXml/itemProps5.xml><?xml version="1.0" encoding="utf-8"?>
+<ds:datastoreItem xmlns:ds="http://schemas.openxmlformats.org/officeDocument/2006/customXml" ds:itemID="{EE9AAF0E-D63F-459F-A0FB-CDCE9F728F33}">
   <ds:schemaRefs>
-    <ds:schemaRef ds:uri="http://schemas.openxmlformats.org/officeDocument/2006/bibliography"/>
-  </ds:schemaRefs>
-</ds:datastoreItem>
-</file>
-
-<file path=customXml/itemProps5.xml><?xml version="1.0" encoding="utf-8"?>
-<ds:datastoreItem xmlns:ds="http://schemas.openxmlformats.org/officeDocument/2006/customXml" ds:itemID="{E1036DFC-1D85-404D-898C-621D06C0EB1C}">
-  <ds:schemaRefs>
-    <ds:schemaRef ds:uri="http://schemas.microsoft.com/office/2006/metadata/properties"/>
-    <ds:schemaRef ds:uri="http://schemas.microsoft.com/office/infopath/2007/PartnerControls"/>
-    <ds:schemaRef ds:uri="e1e7bc46-bed0-459f-9452-a76b1c5b695e"/>
+    <ds:schemaRef ds:uri="http://schemas.microsoft.com/sharepoint/v3/contenttype/forms"/>
   </ds:schemaRefs>
 </ds:datastoreItem>
 </file>
</xml_diff>